<commit_message>
Bill Guest/Respite suites per night instead of per day
A stay from check-in to check-out was previously billed as an
inclusive day count (end - start + 1), which charges for the
checkout day itself. Nights are now end - start, matching standard
night-based billing. Templates updated to say NIGHT/nights instead
of DAY/days to match.

Co-Authored-By: Claude Sonnet 5 <noreply@anthropic.com>
</commit_message>
<xml_diff>
--- a/templates/Guest_TEMPLATE.docx
+++ b/templates/Guest_TEMPLATE.docx
@@ -4499,7 +4499,7 @@
           <w:bCs w:val="0"/>
           <w:szCs w:val="22"/>
         </w:rPr>
-        <w:t>DAILY RESIDENCY FEE</w:t>
+        <w:t>NIGHTLY RESIDENCY FEE</w:t>
       </w:r>
     </w:p>
     <w:p>
@@ -4535,7 +4535,7 @@
           <w:szCs w:val="22"/>
         </w:rPr>
         <w:tab/>
-        <w:t>${daily_rate}/DAY</w:t>
+        <w:t>${daily_rate}/NIGHT</w:t>
         <w:br/>
         <w:t>Resident 2: {second_person_name}</w:t>
         <w:tab/>
@@ -4773,7 +4773,7 @@
           <w:szCs w:val="22"/>
           <w:lang w:val="en-GB"/>
         </w:rPr>
-        <w:t xml:space="preserve">1 person from {start_date}-{end_date} = {nights} days x ${daily_rate} = ${resident_total}     </w:t>
+        <w:t xml:space="preserve">1 person from {start_date}-{end_date} = {nights} nights x ${daily_rate} = ${resident_total}     </w:t>
       </w:r>
     </w:p>
     <w:p>

</xml_diff>